<commit_message>
cambio de objetivo específico, estaba incorrecto.
</commit_message>
<xml_diff>
--- a/docs/documentos/Sistema Inteligente de Monitoreo y Predicción de Recolección de Agua mediante Atrapanieblas en el Centro de Educación Alternativa.docx
+++ b/docs/documentos/Sistema Inteligente de Monitoreo y Predicción de Recolección de Agua mediante Atrapanieblas en el Centro de Educación Alternativa.docx
@@ -2889,31 +2889,7 @@
           <w:color w:val="auto"/>
         </w:rPr>
         <w:lastRenderedPageBreak/>
-        <w:t xml:space="preserve">Argumentación de la importancia del </w:t>
-      </w:r>
-      <w:commentRangeStart w:id="8"/>
-      <w:r>
-        <w:rPr>
-          <w:rFonts w:ascii="Arial" w:hAnsi="Arial" w:cs="Arial"/>
-          <w:color w:val="auto"/>
-        </w:rPr>
-        <w:t>objeto</w:t>
-      </w:r>
-      <w:commentRangeEnd w:id="8"/>
-      <w:r>
-        <w:rPr>
-          <w:rStyle w:val="Refdecomentario"/>
-          <w:rFonts w:asciiTheme="minorHAnsi" w:eastAsiaTheme="minorHAnsi" w:hAnsiTheme="minorHAnsi" w:cstheme="minorBidi"/>
-          <w:color w:val="auto"/>
-        </w:rPr>
-        <w:commentReference w:id="8"/>
-      </w:r>
-      <w:r>
-        <w:rPr>
-          <w:rFonts w:ascii="Arial" w:hAnsi="Arial" w:cs="Arial"/>
-          <w:color w:val="auto"/>
-        </w:rPr>
-        <w:t xml:space="preserve"> de estudio</w:t>
+        <w:t>Argumentación de la importancia del objeto de estudio</w:t>
       </w:r>
       <w:bookmarkEnd w:id="7"/>
     </w:p>
@@ -3022,13 +2998,13 @@
         </w:rPr>
         <w:t>learning</w:t>
       </w:r>
+      <w:proofErr w:type="spellEnd"/>
       <w:r>
         <w:rPr>
           <w:rFonts w:ascii="Arial" w:hAnsi="Arial" w:cs="Arial"/>
         </w:rPr>
         <w:t>:</w:t>
       </w:r>
-      <w:proofErr w:type="spellEnd"/>
     </w:p>
     <w:p>
       <w:pPr>
@@ -3356,7 +3332,7 @@
           <w:color w:val="auto"/>
         </w:rPr>
       </w:pPr>
-      <w:bookmarkStart w:id="9" w:name="_Toc226038123"/>
+      <w:bookmarkStart w:id="8" w:name="_Toc226038123"/>
       <w:r>
         <w:rPr>
           <w:rFonts w:ascii="Arial" w:hAnsi="Arial" w:cs="Arial"/>
@@ -3364,7 +3340,7 @@
         </w:rPr>
         <w:t>Novedad Científica</w:t>
       </w:r>
-      <w:bookmarkEnd w:id="9"/>
+      <w:bookmarkEnd w:id="8"/>
     </w:p>
     <w:p>
       <w:pPr>
@@ -3547,7 +3523,7 @@
           <w:szCs w:val="32"/>
         </w:rPr>
       </w:pPr>
-      <w:bookmarkStart w:id="10" w:name="_Toc226038124"/>
+      <w:bookmarkStart w:id="9" w:name="_Toc226038124"/>
       <w:r>
         <w:rPr>
           <w:rFonts w:ascii="Arial" w:hAnsi="Arial" w:cs="Arial"/>
@@ -3557,7 +3533,7 @@
         </w:rPr>
         <w:t>CAPÍTULO II</w:t>
       </w:r>
-      <w:bookmarkEnd w:id="10"/>
+      <w:bookmarkEnd w:id="9"/>
     </w:p>
     <w:p>
       <w:pPr>
@@ -3572,7 +3548,7 @@
           <w:color w:val="auto"/>
         </w:rPr>
       </w:pPr>
-      <w:bookmarkStart w:id="11" w:name="_Toc226038125"/>
+      <w:bookmarkStart w:id="10" w:name="_Toc226038125"/>
       <w:r>
         <w:rPr>
           <w:rFonts w:ascii="Arial" w:hAnsi="Arial" w:cs="Arial"/>
@@ -3580,7 +3556,7 @@
         </w:rPr>
         <w:t>Justificación del proyecto</w:t>
       </w:r>
-      <w:bookmarkEnd w:id="11"/>
+      <w:bookmarkEnd w:id="10"/>
     </w:p>
     <w:p>
       <w:pPr>
@@ -3595,32 +3571,15 @@
           <w:color w:val="auto"/>
         </w:rPr>
       </w:pPr>
-      <w:bookmarkStart w:id="12" w:name="_Toc226038126"/>
+      <w:bookmarkStart w:id="11" w:name="_Toc226038126"/>
       <w:r>
         <w:rPr>
           <w:rFonts w:ascii="Arial" w:hAnsi="Arial" w:cs="Arial"/>
           <w:color w:val="auto"/>
         </w:rPr>
-        <w:t xml:space="preserve">Justificación </w:t>
-      </w:r>
-      <w:commentRangeStart w:id="13"/>
-      <w:r>
-        <w:rPr>
-          <w:rFonts w:ascii="Arial" w:hAnsi="Arial" w:cs="Arial"/>
-          <w:color w:val="auto"/>
-        </w:rPr>
-        <w:t>técnica</w:t>
-      </w:r>
-      <w:commentRangeEnd w:id="13"/>
-      <w:r>
-        <w:rPr>
-          <w:rStyle w:val="Refdecomentario"/>
-          <w:rFonts w:eastAsiaTheme="minorHAnsi" w:cstheme="minorBidi"/>
-          <w:color w:val="auto"/>
-        </w:rPr>
-        <w:commentReference w:id="13"/>
-      </w:r>
-      <w:bookmarkEnd w:id="12"/>
+        <w:t>Justificación técnica</w:t>
+      </w:r>
+      <w:bookmarkEnd w:id="11"/>
     </w:p>
     <w:p>
       <w:pPr>
@@ -3836,32 +3795,15 @@
           <w:color w:val="auto"/>
         </w:rPr>
       </w:pPr>
-      <w:bookmarkStart w:id="14" w:name="_Toc226038127"/>
+      <w:bookmarkStart w:id="12" w:name="_Toc226038127"/>
       <w:r>
         <w:rPr>
           <w:rFonts w:ascii="Arial" w:hAnsi="Arial" w:cs="Arial"/>
           <w:color w:val="auto"/>
         </w:rPr>
-        <w:t xml:space="preserve">Justificación </w:t>
-      </w:r>
-      <w:commentRangeStart w:id="15"/>
-      <w:r>
-        <w:rPr>
-          <w:rFonts w:ascii="Arial" w:hAnsi="Arial" w:cs="Arial"/>
-          <w:color w:val="auto"/>
-        </w:rPr>
-        <w:t>económica</w:t>
-      </w:r>
-      <w:commentRangeEnd w:id="15"/>
-      <w:r>
-        <w:rPr>
-          <w:rStyle w:val="Refdecomentario"/>
-          <w:rFonts w:eastAsiaTheme="minorHAnsi" w:cstheme="minorBidi"/>
-          <w:color w:val="auto"/>
-        </w:rPr>
-        <w:commentReference w:id="15"/>
-      </w:r>
-      <w:bookmarkEnd w:id="14"/>
+        <w:t>Justificación económica</w:t>
+      </w:r>
+      <w:bookmarkEnd w:id="12"/>
     </w:p>
     <w:p>
       <w:pPr>
@@ -3968,32 +3910,15 @@
           <w:color w:val="auto"/>
         </w:rPr>
       </w:pPr>
-      <w:bookmarkStart w:id="16" w:name="_Toc226038128"/>
+      <w:bookmarkStart w:id="13" w:name="_Toc226038128"/>
       <w:r>
         <w:rPr>
           <w:rFonts w:ascii="Arial" w:hAnsi="Arial" w:cs="Arial"/>
           <w:color w:val="auto"/>
         </w:rPr>
-        <w:t xml:space="preserve">Justificación </w:t>
-      </w:r>
-      <w:commentRangeStart w:id="17"/>
-      <w:r>
-        <w:rPr>
-          <w:rFonts w:ascii="Arial" w:hAnsi="Arial" w:cs="Arial"/>
-          <w:color w:val="auto"/>
-        </w:rPr>
-        <w:t>social</w:t>
-      </w:r>
-      <w:commentRangeEnd w:id="17"/>
-      <w:r>
-        <w:rPr>
-          <w:rStyle w:val="Refdecomentario"/>
-          <w:rFonts w:eastAsiaTheme="minorHAnsi" w:cstheme="minorBidi"/>
-          <w:color w:val="auto"/>
-        </w:rPr>
-        <w:commentReference w:id="17"/>
-      </w:r>
-      <w:bookmarkEnd w:id="16"/>
+        <w:t>Justificación social</w:t>
+      </w:r>
+      <w:bookmarkEnd w:id="13"/>
     </w:p>
     <w:p>
       <w:pPr>
@@ -4127,9 +4052,17 @@
           <w:b/>
           <w:bCs/>
         </w:rPr>
-        <w:t>Titicachi:</w:t>
+        <w:t>Titicachi</w:t>
       </w:r>
       <w:proofErr w:type="spellEnd"/>
+      <w:r>
+        <w:rPr>
+          <w:rFonts w:ascii="Arial" w:hAnsi="Arial" w:cs="Arial"/>
+          <w:b/>
+          <w:bCs/>
+        </w:rPr>
+        <w:t>:</w:t>
+      </w:r>
     </w:p>
     <w:p>
       <w:pPr>
@@ -4211,7 +4144,7 @@
           <w:color w:val="auto"/>
         </w:rPr>
       </w:pPr>
-      <w:bookmarkStart w:id="18" w:name="_Toc226038129"/>
+      <w:bookmarkStart w:id="14" w:name="_Toc226038129"/>
       <w:r>
         <w:rPr>
           <w:rFonts w:ascii="Arial" w:hAnsi="Arial" w:cs="Arial"/>
@@ -4219,7 +4152,7 @@
         </w:rPr>
         <w:t>Especificación de requerimientos</w:t>
       </w:r>
-      <w:bookmarkEnd w:id="18"/>
+      <w:bookmarkEnd w:id="14"/>
     </w:p>
     <w:p>
       <w:pPr>
@@ -8713,7 +8646,7 @@
           <w:szCs w:val="32"/>
         </w:rPr>
       </w:pPr>
-      <w:bookmarkStart w:id="19" w:name="_Toc226038130"/>
+      <w:bookmarkStart w:id="15" w:name="_Toc226038130"/>
       <w:r>
         <w:rPr>
           <w:rFonts w:ascii="Arial" w:hAnsi="Arial" w:cs="Arial"/>
@@ -8724,7 +8657,7 @@
         <w:lastRenderedPageBreak/>
         <w:t>CAPÍTULO III</w:t>
       </w:r>
-      <w:bookmarkEnd w:id="19"/>
+      <w:bookmarkEnd w:id="15"/>
     </w:p>
     <w:p>
       <w:pPr>
@@ -8739,7 +8672,7 @@
           <w:color w:val="auto"/>
         </w:rPr>
       </w:pPr>
-      <w:bookmarkStart w:id="20" w:name="_Toc226038131"/>
+      <w:bookmarkStart w:id="16" w:name="_Toc226038131"/>
       <w:r>
         <w:rPr>
           <w:rFonts w:ascii="Arial" w:hAnsi="Arial" w:cs="Arial"/>
@@ -8747,7 +8680,7 @@
         </w:rPr>
         <w:t>Diseño teórico de la investigación</w:t>
       </w:r>
-      <w:bookmarkEnd w:id="20"/>
+      <w:bookmarkEnd w:id="16"/>
     </w:p>
     <w:p>
       <w:pPr>
@@ -8762,7 +8695,7 @@
           <w:color w:val="auto"/>
         </w:rPr>
       </w:pPr>
-      <w:bookmarkStart w:id="21" w:name="_Toc226038132"/>
+      <w:bookmarkStart w:id="17" w:name="_Toc226038132"/>
       <w:r>
         <w:rPr>
           <w:rFonts w:ascii="Arial" w:hAnsi="Arial" w:cs="Arial"/>
@@ -8770,7 +8703,7 @@
         </w:rPr>
         <w:t>Problemática</w:t>
       </w:r>
-      <w:bookmarkEnd w:id="21"/>
+      <w:bookmarkEnd w:id="17"/>
     </w:p>
     <w:p>
       <w:pPr>
@@ -8846,7 +8779,7 @@
           <w:color w:val="auto"/>
         </w:rPr>
       </w:pPr>
-      <w:bookmarkStart w:id="22" w:name="_Toc226038133"/>
+      <w:bookmarkStart w:id="18" w:name="_Toc226038133"/>
       <w:r>
         <w:rPr>
           <w:rFonts w:ascii="Arial" w:hAnsi="Arial" w:cs="Arial"/>
@@ -8854,7 +8787,7 @@
         </w:rPr>
         <w:t>Formulación del problema</w:t>
       </w:r>
-      <w:bookmarkEnd w:id="22"/>
+      <w:bookmarkEnd w:id="18"/>
     </w:p>
     <w:p>
       <w:pPr>
@@ -8898,32 +8831,15 @@
           <w:color w:val="auto"/>
         </w:rPr>
       </w:pPr>
-      <w:bookmarkStart w:id="23" w:name="_Toc226038134"/>
+      <w:bookmarkStart w:id="19" w:name="_Toc226038134"/>
       <w:r>
         <w:rPr>
           <w:rFonts w:ascii="Arial" w:hAnsi="Arial" w:cs="Arial"/>
           <w:color w:val="auto"/>
         </w:rPr>
-        <w:t xml:space="preserve">Delimitación de </w:t>
-      </w:r>
-      <w:commentRangeStart w:id="24"/>
-      <w:r>
-        <w:rPr>
-          <w:rFonts w:ascii="Arial" w:hAnsi="Arial" w:cs="Arial"/>
-          <w:color w:val="auto"/>
-        </w:rPr>
-        <w:t>contenido</w:t>
-      </w:r>
-      <w:commentRangeEnd w:id="24"/>
-      <w:r>
-        <w:rPr>
-          <w:rStyle w:val="Refdecomentario"/>
-          <w:rFonts w:eastAsiaTheme="minorHAnsi" w:cstheme="minorBidi"/>
-          <w:color w:val="auto"/>
-        </w:rPr>
-        <w:commentReference w:id="24"/>
-      </w:r>
-      <w:bookmarkEnd w:id="23"/>
+        <w:t>Delimitación de contenido</w:t>
+      </w:r>
+      <w:bookmarkEnd w:id="19"/>
     </w:p>
     <w:p>
       <w:pPr>
@@ -8959,19 +8875,7 @@
         <w:rPr>
           <w:rFonts w:ascii="Arial" w:hAnsi="Arial" w:cs="Arial"/>
         </w:rPr>
-        <w:t>El proyecto se centra exclusivamente en el desarrollo</w:t>
-      </w:r>
-      <w:r>
-        <w:rPr>
-          <w:rFonts w:ascii="Arial" w:hAnsi="Arial" w:cs="Arial"/>
-        </w:rPr>
-        <w:t xml:space="preserve"> </w:t>
-      </w:r>
-      <w:r>
-        <w:rPr>
-          <w:rFonts w:ascii="Arial" w:hAnsi="Arial" w:cs="Arial"/>
-        </w:rPr>
-        <w:t>y validación de un sistema completo de captación de agua de niebla que integra:</w:t>
+        <w:t>El proyecto se centra exclusivamente en el desarrollo y validación de un sistema completo de captación de agua de niebla que integra:</w:t>
       </w:r>
     </w:p>
     <w:p>
@@ -9357,33 +9261,16 @@
           <w:color w:val="auto"/>
         </w:rPr>
       </w:pPr>
-      <w:bookmarkStart w:id="25" w:name="_Toc226038135"/>
+      <w:bookmarkStart w:id="20" w:name="_Toc226038135"/>
       <w:r>
         <w:rPr>
           <w:rFonts w:ascii="Arial" w:hAnsi="Arial" w:cs="Arial"/>
           <w:color w:val="auto"/>
         </w:rPr>
         <w:lastRenderedPageBreak/>
-        <w:t xml:space="preserve">Delimitación </w:t>
-      </w:r>
-      <w:commentRangeStart w:id="26"/>
-      <w:r>
-        <w:rPr>
-          <w:rFonts w:ascii="Arial" w:hAnsi="Arial" w:cs="Arial"/>
-          <w:color w:val="auto"/>
-        </w:rPr>
-        <w:t>temporal</w:t>
-      </w:r>
-      <w:commentRangeEnd w:id="26"/>
-      <w:r>
-        <w:rPr>
-          <w:rStyle w:val="Refdecomentario"/>
-          <w:rFonts w:eastAsiaTheme="minorHAnsi" w:cstheme="minorBidi"/>
-          <w:color w:val="auto"/>
-        </w:rPr>
-        <w:commentReference w:id="26"/>
-      </w:r>
-      <w:bookmarkEnd w:id="25"/>
+        <w:t>Delimitación temporal</w:t>
+      </w:r>
+      <w:bookmarkEnd w:id="20"/>
     </w:p>
     <w:p>
       <w:pPr>
@@ -9505,7 +9392,7 @@
           <w:color w:val="auto"/>
         </w:rPr>
       </w:pPr>
-      <w:bookmarkStart w:id="27" w:name="_Toc226038136"/>
+      <w:bookmarkStart w:id="21" w:name="_Toc226038136"/>
       <w:r>
         <w:rPr>
           <w:rFonts w:ascii="Arial" w:hAnsi="Arial" w:cs="Arial"/>
@@ -9513,7 +9400,7 @@
         </w:rPr>
         <w:t>Delimitación espacial</w:t>
       </w:r>
-      <w:bookmarkEnd w:id="27"/>
+      <w:bookmarkEnd w:id="21"/>
     </w:p>
     <w:p>
       <w:pPr>
@@ -9721,7 +9608,7 @@
           <w:szCs w:val="32"/>
         </w:rPr>
       </w:pPr>
-      <w:bookmarkStart w:id="28" w:name="_Toc226038137"/>
+      <w:bookmarkStart w:id="22" w:name="_Toc226038137"/>
       <w:r>
         <w:rPr>
           <w:rFonts w:ascii="Arial" w:hAnsi="Arial" w:cs="Arial"/>
@@ -9732,7 +9619,7 @@
         <w:lastRenderedPageBreak/>
         <w:t>Objetivos</w:t>
       </w:r>
-      <w:bookmarkEnd w:id="28"/>
+      <w:bookmarkEnd w:id="22"/>
       <w:r>
         <w:rPr>
           <w:rFonts w:ascii="Arial" w:hAnsi="Arial" w:cs="Arial"/>
@@ -9908,21 +9795,7 @@
         <w:rPr>
           <w:rFonts w:ascii="Arial" w:hAnsi="Arial" w:cs="Arial"/>
         </w:rPr>
-        <w:t xml:space="preserve"> con ESP32, BME680 y caudalímetro para recopilar datos de temperatura, presión atmosférica y caudal de agua captada por atrapanieblas en el C.E.A. </w:t>
-      </w:r>
-      <w:proofErr w:type="spellStart"/>
-      <w:r>
-        <w:rPr>
-          <w:rFonts w:ascii="Arial" w:hAnsi="Arial" w:cs="Arial"/>
-        </w:rPr>
-        <w:t>Cetha</w:t>
-      </w:r>
-      <w:proofErr w:type="spellEnd"/>
-      <w:r>
-        <w:rPr>
-          <w:rFonts w:ascii="Arial" w:hAnsi="Arial" w:cs="Arial"/>
-        </w:rPr>
-        <w:t xml:space="preserve"> Ildefonso de las Muñecas.</w:t>
+        <w:t xml:space="preserve"> con ESP32, BME680 y caudalímetro para recopilar datos de temperatura, presión atmosférica y caudal de agua captada por atrapaniebla.</w:t>
       </w:r>
     </w:p>
     <w:p>
@@ -9941,21 +9814,21 @@
         <w:rPr>
           <w:rFonts w:ascii="Arial" w:hAnsi="Arial" w:cs="Arial"/>
         </w:rPr>
-        <w:t xml:space="preserve">Entrenar un modelo de machine </w:t>
+        <w:t xml:space="preserve">Implementar un </w:t>
       </w:r>
       <w:proofErr w:type="spellStart"/>
       <w:r>
         <w:rPr>
           <w:rFonts w:ascii="Arial" w:hAnsi="Arial" w:cs="Arial"/>
         </w:rPr>
-        <w:t>learning</w:t>
+        <w:t>dashboard</w:t>
       </w:r>
       <w:proofErr w:type="spellEnd"/>
       <w:r>
         <w:rPr>
           <w:rFonts w:ascii="Arial" w:hAnsi="Arial" w:cs="Arial"/>
         </w:rPr>
-        <w:t xml:space="preserve"> para predecir el volumen de agua diaria y optimizar distribución de riego.</w:t>
+        <w:t xml:space="preserve"> intuitivo integrado vía MCP para comunicación entre modelos ML, sensores y herramientas de gestión del agua.</w:t>
       </w:r>
     </w:p>
     <w:p>
@@ -9974,7 +9847,7 @@
         <w:rPr>
           <w:rFonts w:ascii="Arial" w:hAnsi="Arial" w:cs="Arial"/>
         </w:rPr>
-        <w:t>Desplegar servidor MCP local para interoperabilidad estandarizada entre modelos ML (predicción, control riego, gemelo digital)</w:t>
+        <w:t>Desplegar servidor MCP local para interoperabilidad estandarizada entre modelos ML.</w:t>
       </w:r>
     </w:p>
     <w:p>
@@ -9993,7 +9866,21 @@
         <w:rPr>
           <w:rFonts w:ascii="Arial" w:hAnsi="Arial" w:cs="Arial"/>
         </w:rPr>
-        <w:t>Diseñar un gemelo digital de los invernaderos que simule escenarios de riego para enseñanza agrícola.</w:t>
+        <w:t xml:space="preserve">Entrenar un modelo de machine </w:t>
+      </w:r>
+      <w:proofErr w:type="spellStart"/>
+      <w:r>
+        <w:rPr>
+          <w:rFonts w:ascii="Arial" w:hAnsi="Arial" w:cs="Arial"/>
+        </w:rPr>
+        <w:t>learning</w:t>
+      </w:r>
+      <w:proofErr w:type="spellEnd"/>
+      <w:r>
+        <w:rPr>
+          <w:rFonts w:ascii="Arial" w:hAnsi="Arial" w:cs="Arial"/>
+        </w:rPr>
+        <w:t xml:space="preserve"> para predecir el volumen de agua diaria y optimizar distribución de riego.</w:t>
       </w:r>
     </w:p>
     <w:p>
@@ -10012,21 +9899,27 @@
         <w:rPr>
           <w:rFonts w:ascii="Arial" w:hAnsi="Arial" w:cs="Arial"/>
         </w:rPr>
-        <w:t xml:space="preserve">Implementar un </w:t>
+        <w:t xml:space="preserve">Desarrollar un modelo de machine </w:t>
       </w:r>
       <w:proofErr w:type="spellStart"/>
       <w:r>
         <w:rPr>
           <w:rFonts w:ascii="Arial" w:hAnsi="Arial" w:cs="Arial"/>
         </w:rPr>
-        <w:t>dashboard</w:t>
+        <w:t>learning</w:t>
       </w:r>
       <w:proofErr w:type="spellEnd"/>
       <w:r>
         <w:rPr>
           <w:rFonts w:ascii="Arial" w:hAnsi="Arial" w:cs="Arial"/>
         </w:rPr>
-        <w:t xml:space="preserve"> intuitivo integrado vía MCP para comunicación entre modelos ML, sensores y herramientas de gestión del agua.</w:t>
+        <w:t xml:space="preserve"> para simular escenarios hipotéticos de riego futuros</w:t>
+      </w:r>
+      <w:r>
+        <w:rPr>
+          <w:rFonts w:ascii="Arial" w:hAnsi="Arial" w:cs="Arial"/>
+        </w:rPr>
+        <w:t>.</w:t>
       </w:r>
     </w:p>
     <w:p>
@@ -10064,7 +9957,7 @@
     </w:p>
     <w:p/>
     <w:sectPr>
-      <w:headerReference w:type="default" r:id="rId13"/>
+      <w:headerReference w:type="default" r:id="rId9"/>
       <w:pgSz w:w="12240" w:h="15840" w:code="1"/>
       <w:pgMar w:top="1418" w:right="1418" w:bottom="1418" w:left="1418" w:header="709" w:footer="709" w:gutter="0"/>
       <w:cols w:space="708"/>
@@ -10072,168 +9965,6 @@
     </w:sectPr>
   </w:body>
 </w:document>
-</file>
-
-<file path=word/comments.xml><?xml version="1.0" encoding="utf-8"?>
-<w:comments xmlns:wpc="http://schemas.microsoft.com/office/word/2010/wordprocessingCanvas" xmlns:cx="http://schemas.microsoft.com/office/drawing/2014/chartex" xmlns:cx1="http://schemas.microsoft.com/office/drawing/2015/9/8/chartex" xmlns:cx2="http://schemas.microsoft.com/office/drawing/2015/10/21/chartex" xmlns:cx3="http://schemas.microsoft.com/office/drawing/2016/5/9/chartex" xmlns:cx4="http://schemas.microsoft.com/office/drawing/2016/5/10/chartex" xmlns:cx5="http://schemas.microsoft.com/office/drawing/2016/5/11/chartex" xmlns:cx6="http://schemas.microsoft.com/office/drawing/2016/5/12/chartex" xmlns:cx7="http://schemas.microsoft.com/office/drawing/2016/5/13/chartex" xmlns:cx8="http://schemas.microsoft.com/office/drawing/2016/5/14/chartex" xmlns:mc="http://schemas.openxmlformats.org/markup-compatibility/2006" xmlns:aink="http://schemas.microsoft.com/office/drawing/2016/ink" xmlns:am3d="http://schemas.microsoft.com/office/drawing/2017/model3d" xmlns:o="urn:schemas-microsoft-com:office:office" xmlns:oel="http://schemas.microsoft.com/office/2019/extlst" xmlns:r="http://schemas.openxmlformats.org/officeDocument/2006/relationships" xmlns:m="http://schemas.openxmlformats.org/officeDocument/2006/math" xmlns:v="urn:schemas-microsoft-com:vml" xmlns:wp14="http://schemas.microsoft.com/office/word/2010/wordprocessingDrawing" xmlns:wp="http://schemas.openxmlformats.org/drawingml/2006/wordprocessingDrawing" xmlns:w10="urn:schemas-microsoft-com:office:word" xmlns:w="http://schemas.openxmlformats.org/wordprocessingml/2006/main" xmlns:w14="http://schemas.microsoft.com/office/word/2010/wordml" xmlns:w15="http://schemas.microsoft.com/office/word/2012/wordml" xmlns:w16cex="http://schemas.microsoft.com/office/word/2018/wordml/cex" xmlns:w16cid="http://schemas.microsoft.com/office/word/2016/wordml/cid" xmlns:w16="http://schemas.microsoft.com/office/word/2018/wordml" xmlns:w16sdtdh="http://schemas.microsoft.com/office/word/2020/wordml/sdtdatahash" xmlns:w16se="http://schemas.microsoft.com/office/word/2015/wordml/symex" xmlns:wpg="http://schemas.microsoft.com/office/word/2010/wordprocessingGroup" xmlns:wpi="http://schemas.microsoft.com/office/word/2010/wordprocessingInk" xmlns:wne="http://schemas.microsoft.com/office/word/2006/wordml" xmlns:wps="http://schemas.microsoft.com/office/word/2010/wordprocessingShape" mc:Ignorable="w14 w15 w16se w16cid w16 w16cex w16sdtdh wp14">
-  <w:comment w:id="8" w:author="Limber Romero" w:date="2026-03-26T20:13:00Z" w:initials="LR">
-    <w:p>
-      <w:pPr>
-        <w:pStyle w:val="Textocomentario"/>
-      </w:pPr>
-      <w:r>
-        <w:rPr>
-          <w:rStyle w:val="Refdecomentario"/>
-        </w:rPr>
-        <w:annotationRef/>
-      </w:r>
-      <w:r>
-        <w:t>Aporte ingenieril, explicación de mi MCP y ML</w:t>
-      </w:r>
-    </w:p>
-  </w:comment>
-  <w:comment w:id="13" w:author="Limber Romero" w:date="2026-03-26T19:28:00Z" w:initials="LR">
-    <w:p>
-      <w:pPr>
-        <w:pStyle w:val="Textocomentario"/>
-      </w:pPr>
-      <w:r>
-        <w:rPr>
-          <w:rStyle w:val="Refdecomentario"/>
-        </w:rPr>
-        <w:annotationRef/>
-      </w:r>
-      <w:proofErr w:type="gramStart"/>
-      <w:r>
-        <w:t>Que?</w:t>
-      </w:r>
-      <w:proofErr w:type="gramEnd"/>
-      <w:r>
-        <w:t xml:space="preserve"> </w:t>
-      </w:r>
-      <w:proofErr w:type="gramStart"/>
-      <w:r>
-        <w:t xml:space="preserve">Y </w:t>
-      </w:r>
-      <w:proofErr w:type="spellStart"/>
-      <w:r>
-        <w:t>por que</w:t>
-      </w:r>
-      <w:proofErr w:type="spellEnd"/>
-      <w:r>
-        <w:t>?</w:t>
-      </w:r>
-      <w:proofErr w:type="gramEnd"/>
-    </w:p>
-  </w:comment>
-  <w:comment w:id="15" w:author="Limber Romero" w:date="2026-03-26T19:43:00Z" w:initials="LR">
-    <w:p>
-      <w:pPr>
-        <w:pStyle w:val="Textocomentario"/>
-      </w:pPr>
-      <w:r>
-        <w:rPr>
-          <w:rStyle w:val="Refdecomentario"/>
-        </w:rPr>
-        <w:annotationRef/>
-      </w:r>
-      <w:r>
-        <w:t>Costo-beneficio o eficiencia</w:t>
-      </w:r>
-    </w:p>
-  </w:comment>
-  <w:comment w:id="17" w:author="Limber Romero" w:date="2026-03-26T19:43:00Z" w:initials="LR">
-    <w:p>
-      <w:pPr>
-        <w:pStyle w:val="Textocomentario"/>
-      </w:pPr>
-      <w:r>
-        <w:rPr>
-          <w:rStyle w:val="Refdecomentario"/>
-        </w:rPr>
-        <w:annotationRef/>
-      </w:r>
-      <w:proofErr w:type="gramStart"/>
-      <w:r>
-        <w:t xml:space="preserve">Quienes y </w:t>
-      </w:r>
-      <w:proofErr w:type="spellStart"/>
-      <w:r>
-        <w:t>por que</w:t>
-      </w:r>
-      <w:proofErr w:type="spellEnd"/>
-      <w:r>
-        <w:t>?</w:t>
-      </w:r>
-      <w:proofErr w:type="gramEnd"/>
-    </w:p>
-  </w:comment>
-  <w:comment w:id="24" w:author="Limber Romero" w:date="2026-03-26T20:06:00Z" w:initials="LR">
-    <w:p>
-      <w:pPr>
-        <w:pStyle w:val="Textocomentario"/>
-      </w:pPr>
-      <w:r>
-        <w:rPr>
-          <w:rStyle w:val="Refdecomentario"/>
-        </w:rPr>
-        <w:annotationRef/>
-      </w:r>
-      <w:r>
-        <w:t>Límites y alcances</w:t>
-      </w:r>
-    </w:p>
-  </w:comment>
-  <w:comment w:id="26" w:author="Limber Romero" w:date="2026-03-26T20:09:00Z" w:initials="LR">
-    <w:p>
-      <w:pPr>
-        <w:pStyle w:val="Textocomentario"/>
-      </w:pPr>
-      <w:r>
-        <w:rPr>
-          <w:rStyle w:val="Refdecomentario"/>
-        </w:rPr>
-        <w:annotationRef/>
-      </w:r>
-      <w:r>
-        <w:t>Tiempo total del proyecto</w:t>
-      </w:r>
-    </w:p>
-  </w:comment>
-</w:comments>
-</file>
-
-<file path=word/commentsExtended.xml><?xml version="1.0" encoding="utf-8"?>
-<w15:commentsEx xmlns:wpc="http://schemas.microsoft.com/office/word/2010/wordprocessingCanvas" xmlns:cx="http://schemas.microsoft.com/office/drawing/2014/chartex" xmlns:cx1="http://schemas.microsoft.com/office/drawing/2015/9/8/chartex" xmlns:cx2="http://schemas.microsoft.com/office/drawing/2015/10/21/chartex" xmlns:cx3="http://schemas.microsoft.com/office/drawing/2016/5/9/chartex" xmlns:cx4="http://schemas.microsoft.com/office/drawing/2016/5/10/chartex" xmlns:cx5="http://schemas.microsoft.com/office/drawing/2016/5/11/chartex" xmlns:cx6="http://schemas.microsoft.com/office/drawing/2016/5/12/chartex" xmlns:cx7="http://schemas.microsoft.com/office/drawing/2016/5/13/chartex" xmlns:cx8="http://schemas.microsoft.com/office/drawing/2016/5/14/chartex" xmlns:mc="http://schemas.openxmlformats.org/markup-compatibility/2006" xmlns:aink="http://schemas.microsoft.com/office/drawing/2016/ink" xmlns:am3d="http://schemas.microsoft.com/office/drawing/2017/model3d" xmlns:o="urn:schemas-microsoft-com:office:office" xmlns:oel="http://schemas.microsoft.com/office/2019/extlst" xmlns:r="http://schemas.openxmlformats.org/officeDocument/2006/relationships" xmlns:m="http://schemas.openxmlformats.org/officeDocument/2006/math" xmlns:v="urn:schemas-microsoft-com:vml" xmlns:wp14="http://schemas.microsoft.com/office/word/2010/wordprocessingDrawing" xmlns:wp="http://schemas.openxmlformats.org/drawingml/2006/wordprocessingDrawing" xmlns:w10="urn:schemas-microsoft-com:office:word" xmlns:w="http://schemas.openxmlformats.org/wordprocessingml/2006/main" xmlns:w14="http://schemas.microsoft.com/office/word/2010/wordml" xmlns:w15="http://schemas.microsoft.com/office/word/2012/wordml" xmlns:w16cex="http://schemas.microsoft.com/office/word/2018/wordml/cex" xmlns:w16cid="http://schemas.microsoft.com/office/word/2016/wordml/cid" xmlns:w16="http://schemas.microsoft.com/office/word/2018/wordml" xmlns:w16sdtdh="http://schemas.microsoft.com/office/word/2020/wordml/sdtdatahash" xmlns:w16se="http://schemas.microsoft.com/office/word/2015/wordml/symex" xmlns:wpg="http://schemas.microsoft.com/office/word/2010/wordprocessingGroup" xmlns:wpi="http://schemas.microsoft.com/office/word/2010/wordprocessingInk" xmlns:wne="http://schemas.microsoft.com/office/word/2006/wordml" xmlns:wps="http://schemas.microsoft.com/office/word/2010/wordprocessingShape" mc:Ignorable="w14 w15 w16se w16cid w16 w16cex w16sdtdh wp14">
-  <w15:commentEx w15:paraId="09C8A2F2" w15:done="0"/>
-  <w15:commentEx w15:paraId="07847E90" w15:done="0"/>
-  <w15:commentEx w15:paraId="3026B1FA" w15:done="0"/>
-  <w15:commentEx w15:paraId="7596676C" w15:done="0"/>
-  <w15:commentEx w15:paraId="6BF84A20" w15:done="0"/>
-  <w15:commentEx w15:paraId="1A97EB72" w15:done="0"/>
-</w15:commentsEx>
-</file>
-
-<file path=word/commentsExtensible.xml><?xml version="1.0" encoding="utf-8"?>
-<w16cex:commentsExtensible xmlns:wpc="http://schemas.microsoft.com/office/word/2010/wordprocessingCanvas" xmlns:cx="http://schemas.microsoft.com/office/drawing/2014/chartex" xmlns:cx1="http://schemas.microsoft.com/office/drawing/2015/9/8/chartex" xmlns:cx2="http://schemas.microsoft.com/office/drawing/2015/10/21/chartex" xmlns:cx3="http://schemas.microsoft.com/office/drawing/2016/5/9/chartex" xmlns:cx4="http://schemas.microsoft.com/office/drawing/2016/5/10/chartex" xmlns:cx5="http://schemas.microsoft.com/office/drawing/2016/5/11/chartex" xmlns:cx6="http://schemas.microsoft.com/office/drawing/2016/5/12/chartex" xmlns:cx7="http://schemas.microsoft.com/office/drawing/2016/5/13/chartex" xmlns:cx8="http://schemas.microsoft.com/office/drawing/2016/5/14/chartex" xmlns:cr="http://schemas.microsoft.com/office/comments/2020/reactions" xmlns:mc="http://schemas.openxmlformats.org/markup-compatibility/2006" xmlns:aink="http://schemas.microsoft.com/office/drawing/2016/ink" xmlns:am3d="http://schemas.microsoft.com/office/drawing/2017/model3d" xmlns:o="urn:schemas-microsoft-com:office:office" xmlns:oel="http://schemas.microsoft.com/office/2019/extlst" xmlns:r="http://schemas.openxmlformats.org/officeDocument/2006/relationships" xmlns:m="http://schemas.openxmlformats.org/officeDocument/2006/math" xmlns:v="urn:schemas-microsoft-com:vml" xmlns:wp14="http://schemas.microsoft.com/office/word/2010/wordprocessingDrawing" xmlns:wp="http://schemas.openxmlformats.org/drawingml/2006/wordprocessingDrawing" xmlns:w10="urn:schemas-microsoft-com:office:word" xmlns:w="http://schemas.openxmlformats.org/wordprocessingml/2006/main" xmlns:w14="http://schemas.microsoft.com/office/word/2010/wordml" xmlns:w15="http://schemas.microsoft.com/office/word/2012/wordml" xmlns:w16cex="http://schemas.microsoft.com/office/word/2018/wordml/cex" xmlns:w16cid="http://schemas.microsoft.com/office/word/2016/wordml/cid" xmlns:w16="http://schemas.microsoft.com/office/word/2018/wordml" xmlns:w16sdtdh="http://schemas.microsoft.com/office/word/2020/wordml/sdtdatahash" xmlns:w16se="http://schemas.microsoft.com/office/word/2015/wordml/symex" xmlns:wpg="http://schemas.microsoft.com/office/word/2010/wordprocessingGroup" xmlns:wpi="http://schemas.microsoft.com/office/word/2010/wordprocessingInk" xmlns:wne="http://schemas.microsoft.com/office/word/2006/wordml" xmlns:wps="http://schemas.microsoft.com/office/word/2010/wordprocessingShape" mc:Ignorable="w14 w15 w16se w16cid w16 w16cex w16sdtdh cr wp14">
-  <w16cex:commentExtensible w16cex:durableId="46E4F757" w16cex:dateUtc="2026-03-27T00:13:00Z"/>
-  <w16cex:commentExtensible w16cex:durableId="123C4276" w16cex:dateUtc="2026-03-26T23:28:00Z"/>
-  <w16cex:commentExtensible w16cex:durableId="21AFFDDC" w16cex:dateUtc="2026-03-26T23:43:00Z"/>
-  <w16cex:commentExtensible w16cex:durableId="6A6D5E55" w16cex:dateUtc="2026-03-26T23:43:00Z"/>
-  <w16cex:commentExtensible w16cex:durableId="414B177D" w16cex:dateUtc="2026-03-27T00:06:00Z"/>
-  <w16cex:commentExtensible w16cex:durableId="46335DEE" w16cex:dateUtc="2026-03-27T00:09:00Z"/>
-</w16cex:commentsExtensible>
-</file>
-
-<file path=word/commentsIds.xml><?xml version="1.0" encoding="utf-8"?>
-<w16cid:commentsIds xmlns:wpc="http://schemas.microsoft.com/office/word/2010/wordprocessingCanvas" xmlns:cx="http://schemas.microsoft.com/office/drawing/2014/chartex" xmlns:cx1="http://schemas.microsoft.com/office/drawing/2015/9/8/chartex" xmlns:cx2="http://schemas.microsoft.com/office/drawing/2015/10/21/chartex" xmlns:cx3="http://schemas.microsoft.com/office/drawing/2016/5/9/chartex" xmlns:cx4="http://schemas.microsoft.com/office/drawing/2016/5/10/chartex" xmlns:cx5="http://schemas.microsoft.com/office/drawing/2016/5/11/chartex" xmlns:cx6="http://schemas.microsoft.com/office/drawing/2016/5/12/chartex" xmlns:cx7="http://schemas.microsoft.com/office/drawing/2016/5/13/chartex" xmlns:cx8="http://schemas.microsoft.com/office/drawing/2016/5/14/chartex" xmlns:mc="http://schemas.openxmlformats.org/markup-compatibility/2006" xmlns:aink="http://schemas.microsoft.com/office/drawing/2016/ink" xmlns:am3d="http://schemas.microsoft.com/office/drawing/2017/model3d" xmlns:o="urn:schemas-microsoft-com:office:office" xmlns:oel="http://schemas.microsoft.com/office/2019/extlst" xmlns:r="http://schemas.openxmlformats.org/officeDocument/2006/relationships" xmlns:m="http://schemas.openxmlformats.org/officeDocument/2006/math" xmlns:v="urn:schemas-microsoft-com:vml" xmlns:wp14="http://schemas.microsoft.com/office/word/2010/wordprocessingDrawing" xmlns:wp="http://schemas.openxmlformats.org/drawingml/2006/wordprocessingDrawing" xmlns:w10="urn:schemas-microsoft-com:office:word" xmlns:w="http://schemas.openxmlformats.org/wordprocessingml/2006/main" xmlns:w14="http://schemas.microsoft.com/office/word/2010/wordml" xmlns:w15="http://schemas.microsoft.com/office/word/2012/wordml" xmlns:w16cex="http://schemas.microsoft.com/office/word/2018/wordml/cex" xmlns:w16cid="http://schemas.microsoft.com/office/word/2016/wordml/cid" xmlns:w16="http://schemas.microsoft.com/office/word/2018/wordml" xmlns:w16sdtdh="http://schemas.microsoft.com/office/word/2020/wordml/sdtdatahash" xmlns:w16se="http://schemas.microsoft.com/office/word/2015/wordml/symex" xmlns:wpg="http://schemas.microsoft.com/office/word/2010/wordprocessingGroup" xmlns:wpi="http://schemas.microsoft.com/office/word/2010/wordprocessingInk" xmlns:wne="http://schemas.microsoft.com/office/word/2006/wordml" xmlns:wps="http://schemas.microsoft.com/office/word/2010/wordprocessingShape" mc:Ignorable="w14 w15 w16se w16cid w16 w16cex w16sdtdh wp14">
-  <w16cid:commentId w16cid:paraId="09C8A2F2" w16cid:durableId="46E4F757"/>
-  <w16cid:commentId w16cid:paraId="07847E90" w16cid:durableId="123C4276"/>
-  <w16cid:commentId w16cid:paraId="3026B1FA" w16cid:durableId="21AFFDDC"/>
-  <w16cid:commentId w16cid:paraId="7596676C" w16cid:durableId="6A6D5E55"/>
-  <w16cid:commentId w16cid:paraId="6BF84A20" w16cid:durableId="414B177D"/>
-  <w16cid:commentId w16cid:paraId="1A97EB72" w16cid:durableId="46335DEE"/>
-</w16cid:commentsIds>
 </file>
 
 <file path=word/endnotes.xml><?xml version="1.0" encoding="utf-8"?>
@@ -14315,14 +14046,6 @@
     <w:abstractNumId w:val="16"/>
   </w:num>
 </w:numbering>
-</file>
-
-<file path=word/people.xml><?xml version="1.0" encoding="utf-8"?>
-<w15:people xmlns:wpc="http://schemas.microsoft.com/office/word/2010/wordprocessingCanvas" xmlns:cx="http://schemas.microsoft.com/office/drawing/2014/chartex" xmlns:cx1="http://schemas.microsoft.com/office/drawing/2015/9/8/chartex" xmlns:cx2="http://schemas.microsoft.com/office/drawing/2015/10/21/chartex" xmlns:cx3="http://schemas.microsoft.com/office/drawing/2016/5/9/chartex" xmlns:cx4="http://schemas.microsoft.com/office/drawing/2016/5/10/chartex" xmlns:cx5="http://schemas.microsoft.com/office/drawing/2016/5/11/chartex" xmlns:cx6="http://schemas.microsoft.com/office/drawing/2016/5/12/chartex" xmlns:cx7="http://schemas.microsoft.com/office/drawing/2016/5/13/chartex" xmlns:cx8="http://schemas.microsoft.com/office/drawing/2016/5/14/chartex" xmlns:mc="http://schemas.openxmlformats.org/markup-compatibility/2006" xmlns:aink="http://schemas.microsoft.com/office/drawing/2016/ink" xmlns:am3d="http://schemas.microsoft.com/office/drawing/2017/model3d" xmlns:o="urn:schemas-microsoft-com:office:office" xmlns:oel="http://schemas.microsoft.com/office/2019/extlst" xmlns:r="http://schemas.openxmlformats.org/officeDocument/2006/relationships" xmlns:m="http://schemas.openxmlformats.org/officeDocument/2006/math" xmlns:v="urn:schemas-microsoft-com:vml" xmlns:wp14="http://schemas.microsoft.com/office/word/2010/wordprocessingDrawing" xmlns:wp="http://schemas.openxmlformats.org/drawingml/2006/wordprocessingDrawing" xmlns:w10="urn:schemas-microsoft-com:office:word" xmlns:w="http://schemas.openxmlformats.org/wordprocessingml/2006/main" xmlns:w14="http://schemas.microsoft.com/office/word/2010/wordml" xmlns:w15="http://schemas.microsoft.com/office/word/2012/wordml" xmlns:w16cex="http://schemas.microsoft.com/office/word/2018/wordml/cex" xmlns:w16cid="http://schemas.microsoft.com/office/word/2016/wordml/cid" xmlns:w16="http://schemas.microsoft.com/office/word/2018/wordml" xmlns:w16sdtdh="http://schemas.microsoft.com/office/word/2020/wordml/sdtdatahash" xmlns:w16se="http://schemas.microsoft.com/office/word/2015/wordml/symex" xmlns:wpg="http://schemas.microsoft.com/office/word/2010/wordprocessingGroup" xmlns:wpi="http://schemas.microsoft.com/office/word/2010/wordprocessingInk" xmlns:wne="http://schemas.microsoft.com/office/word/2006/wordml" xmlns:wps="http://schemas.microsoft.com/office/word/2010/wordprocessingShape" mc:Ignorable="w14 w15 w16se w16cid w16 w16cex w16sdtdh wp14">
-  <w15:person w15:author="Limber Romero">
-    <w15:presenceInfo w15:providerId="Windows Live" w15:userId="a8422c99a0415fac"/>
-  </w15:person>
-</w15:people>
 </file>
 
 <file path=word/styles.xml><?xml version="1.0" encoding="utf-8"?>

</xml_diff>